<commit_message>
Added script for image compression
</commit_message>
<xml_diff>
--- a/docs/Portfolio — Technical Manual.docx
+++ b/docs/Portfolio — Technical Manual.docx
@@ -114,7 +114,7 @@
           <w:sz w:val="22"/>
           <w:szCs w:val="22"/>
         </w:rPr>
-        <w:t xml:space="preserve">Version 1.0  ·  Oct 28, 2026</w:t>
+        <w:t xml:space="preserve">Version 1.1  ·  Oct 28, 2026</w:t>
       </w:r>
     </w:p>
     <w:p>
@@ -754,6 +754,20 @@
         <w:t xml:space="preserve">7.8</w:t>
         <w:tab/>
         <w:t xml:space="preserve">Verification</w:t>
+      </w:r>
+    </w:p>
+    <w:p>
+      <w:pPr>
+        <w:pStyle w:val="TOC2"/>
+        <w:tabs>
+          <w:tab w:val="left" w:pos="1100"/>
+        </w:tabs>
+        <w:ind w:left="500"/>
+      </w:pPr>
+      <w:r>
+        <w:t xml:space="preserve">7.9</w:t>
+        <w:tab/>
+        <w:t xml:space="preserve">Image optimization</w:t>
       </w:r>
     </w:p>
     <w:p>
@@ -8762,6 +8776,40 @@
     </w:p>
     <w:p>
       <w:pPr>
+        <w:pStyle w:val="ListParagraph"/>
+        <w:numPr>
+          <w:ilvl w:val="0"/>
+          <w:numId w:val="3"/>
+        </w:numPr>
+        <w:spacing w:after="60" w:line="264"/>
+      </w:pPr>
+      <w:r>
+        <w:rPr>
+          <w:rFonts w:ascii="Calibri" w:cs="Calibri" w:eastAsia="Calibri" w:hAnsi="Calibri"/>
+          <w:color w:val="1F2937"/>
+        </w:rPr>
+        <w:t xml:space="preserve">New or replaced images are converted with </w:t>
+      </w:r>
+      <w:r>
+        <w:rPr>
+          <w:rFonts w:ascii="Courier New" w:cs="Courier New" w:eastAsia="Courier New" w:hAnsi="Courier New"/>
+          <w:color w:val="1F2937"/>
+          <w:sz w:val="18"/>
+          <w:szCs w:val="18"/>
+          <w:shd w:fill="EEF1F6" w:color="auto" w:val="clear"/>
+        </w:rPr>
+        <w:t xml:space="preserve">npm run images</w:t>
+      </w:r>
+      <w:r>
+        <w:rPr>
+          <w:rFonts w:ascii="Calibri" w:cs="Calibri" w:eastAsia="Calibri" w:hAnsi="Calibri"/>
+          <w:color w:val="1F2937"/>
+        </w:rPr>
+        <w:t xml:space="preserve"> (section 7.9).</w:t>
+      </w:r>
+    </w:p>
+    <w:p>
+      <w:pPr>
         <w:pStyle w:val="Heading3"/>
         <w:keepNext/>
         <w:numPr>
@@ -16672,6 +16720,76 @@
           </w:p>
         </w:tc>
       </w:tr>
+      <w:tr>
+        <w:trPr>
+          <w:cantSplit/>
+        </w:trPr>
+        <w:tc>
+          <w:tcPr>
+            <w:tcW w:type="dxa" w:w="2600"/>
+            <w:tcBorders>
+              <w:top w:val="single" w:color="C9D3E3" w:sz="4"/>
+              <w:left w:val="single" w:color="C9D3E3" w:sz="4"/>
+              <w:bottom w:val="single" w:color="C9D3E3" w:sz="4"/>
+              <w:right w:val="single" w:color="C9D3E3" w:sz="4"/>
+            </w:tcBorders>
+            <w:shd w:fill="EEF1F6" w:color="auto" w:val="clear"/>
+            <w:tcMar>
+              <w:top w:type="dxa" w:w="60"/>
+              <w:left w:type="dxa" w:w="100"/>
+              <w:bottom w:type="dxa" w:w="60"/>
+              <w:right w:type="dxa" w:w="100"/>
+            </w:tcMar>
+          </w:tcPr>
+          <w:p>
+            <w:pPr>
+              <w:spacing w:after="0" w:line="252"/>
+            </w:pPr>
+            <w:r>
+              <w:rPr>
+                <w:rFonts w:ascii="Courier New" w:cs="Courier New" w:eastAsia="Courier New" w:hAnsi="Courier New"/>
+                <w:color w:val="1F2937"/>
+                <w:sz w:val="18"/>
+                <w:szCs w:val="18"/>
+                <w:shd w:fill="EEF1F6" w:color="auto" w:val="clear"/>
+              </w:rPr>
+              <w:t xml:space="preserve">npm run images</w:t>
+            </w:r>
+          </w:p>
+        </w:tc>
+        <w:tc>
+          <w:tcPr>
+            <w:tcW w:type="dxa" w:w="6000"/>
+            <w:tcBorders>
+              <w:top w:val="single" w:color="C9D3E3" w:sz="4"/>
+              <w:left w:val="single" w:color="C9D3E3" w:sz="4"/>
+              <w:bottom w:val="single" w:color="C9D3E3" w:sz="4"/>
+              <w:right w:val="single" w:color="C9D3E3" w:sz="4"/>
+            </w:tcBorders>
+            <w:shd w:fill="EEF1F6" w:color="auto" w:val="clear"/>
+            <w:tcMar>
+              <w:top w:type="dxa" w:w="60"/>
+              <w:left w:type="dxa" w:w="100"/>
+              <w:bottom w:type="dxa" w:w="60"/>
+              <w:right w:type="dxa" w:w="100"/>
+            </w:tcMar>
+          </w:tcPr>
+          <w:p>
+            <w:pPr>
+              <w:spacing w:after="0" w:line="252"/>
+            </w:pPr>
+            <w:r>
+              <w:rPr>
+                <w:rFonts w:ascii="Calibri" w:cs="Calibri" w:eastAsia="Calibri" w:hAnsi="Calibri"/>
+                <w:color w:val="1F2937"/>
+                <w:sz w:val="19"/>
+                <w:szCs w:val="19"/>
+              </w:rPr>
+              <w:t xml:space="preserve">Converts new or replaced images to resized WebP and deletes the originals (section 7.9)</w:t>
+            </w:r>
+          </w:p>
+        </w:tc>
+      </w:tr>
     </w:tbl>
     <w:p>
       <w:pPr>
@@ -17883,6 +18001,86 @@
                 <w:shd w:fill="EEF1F6" w:color="auto" w:val="clear"/>
               </w:rPr>
               <w:t xml:space="preserve">public/assets</w:t>
+            </w:r>
+          </w:p>
+        </w:tc>
+      </w:tr>
+      <w:tr>
+        <w:trPr>
+          <w:cantSplit/>
+        </w:trPr>
+        <w:tc>
+          <w:tcPr>
+            <w:tcW w:type="dxa" w:w="2600"/>
+            <w:tcBorders>
+              <w:top w:val="single" w:color="C9D3E3" w:sz="4"/>
+              <w:left w:val="single" w:color="C9D3E3" w:sz="4"/>
+              <w:bottom w:val="single" w:color="C9D3E3" w:sz="4"/>
+              <w:right w:val="single" w:color="C9D3E3" w:sz="4"/>
+            </w:tcBorders>
+            <w:shd w:fill="EEF1F6" w:color="auto" w:val="clear"/>
+            <w:tcMar>
+              <w:top w:type="dxa" w:w="60"/>
+              <w:left w:type="dxa" w:w="100"/>
+              <w:bottom w:type="dxa" w:w="60"/>
+              <w:right w:type="dxa" w:w="100"/>
+            </w:tcMar>
+          </w:tcPr>
+          <w:p>
+            <w:pPr>
+              <w:spacing w:after="0" w:line="252"/>
+            </w:pPr>
+            <w:r>
+              <w:rPr>
+                <w:rFonts w:ascii="Courier New" w:cs="Courier New" w:eastAsia="Courier New" w:hAnsi="Courier New"/>
+                <w:color w:val="1F2937"/>
+                <w:sz w:val="18"/>
+                <w:szCs w:val="18"/>
+                <w:shd w:fill="EEF1F6" w:color="auto" w:val="clear"/>
+              </w:rPr>
+              <w:t xml:space="preserve">endOfLine</w:t>
+            </w:r>
+          </w:p>
+        </w:tc>
+        <w:tc>
+          <w:tcPr>
+            <w:tcW w:type="dxa" w:w="6000"/>
+            <w:tcBorders>
+              <w:top w:val="single" w:color="C9D3E3" w:sz="4"/>
+              <w:left w:val="single" w:color="C9D3E3" w:sz="4"/>
+              <w:bottom w:val="single" w:color="C9D3E3" w:sz="4"/>
+              <w:right w:val="single" w:color="C9D3E3" w:sz="4"/>
+            </w:tcBorders>
+            <w:shd w:fill="EEF1F6" w:color="auto" w:val="clear"/>
+            <w:tcMar>
+              <w:top w:type="dxa" w:w="60"/>
+              <w:left w:type="dxa" w:w="100"/>
+              <w:bottom w:type="dxa" w:w="60"/>
+              <w:right w:type="dxa" w:w="100"/>
+            </w:tcMar>
+          </w:tcPr>
+          <w:p>
+            <w:pPr>
+              <w:spacing w:after="0" w:line="252"/>
+            </w:pPr>
+            <w:r>
+              <w:rPr>
+                <w:rFonts w:ascii="Courier New" w:cs="Courier New" w:eastAsia="Courier New" w:hAnsi="Courier New"/>
+                <w:color w:val="1F2937"/>
+                <w:sz w:val="18"/>
+                <w:szCs w:val="18"/>
+                <w:shd w:fill="EEF1F6" w:color="auto" w:val="clear"/>
+              </w:rPr>
+              <w:t xml:space="preserve">auto</w:t>
+            </w:r>
+            <w:r>
+              <w:rPr>
+                <w:rFonts w:ascii="Calibri" w:cs="Calibri" w:eastAsia="Calibri" w:hAnsi="Calibri"/>
+                <w:color w:val="1F2937"/>
+                <w:sz w:val="19"/>
+                <w:szCs w:val="19"/>
+              </w:rPr>
+              <w:t xml:space="preserve">: keeps each file's line endings, so a Windows checkout (CRLF) passes the check; git stores them as LF</w:t>
             </w:r>
           </w:p>
         </w:tc>
@@ -19986,6 +20184,126 @@
                 <w:szCs w:val="19"/>
               </w:rPr>
               <w:t xml:space="preserve">Formats Angular control flow</w:t>
+            </w:r>
+          </w:p>
+        </w:tc>
+      </w:tr>
+      <w:tr>
+        <w:trPr>
+          <w:cantSplit/>
+        </w:trPr>
+        <w:tc>
+          <w:tcPr>
+            <w:tcW w:type="dxa" w:w="2700"/>
+            <w:tcBorders>
+              <w:top w:val="single" w:color="C9D3E3" w:sz="4"/>
+              <w:left w:val="single" w:color="C9D3E3" w:sz="4"/>
+              <w:bottom w:val="single" w:color="C9D3E3" w:sz="4"/>
+              <w:right w:val="single" w:color="C9D3E3" w:sz="4"/>
+            </w:tcBorders>
+            <w:shd w:fill="F3F6FC" w:color="auto" w:val="clear"/>
+            <w:tcMar>
+              <w:top w:type="dxa" w:w="60"/>
+              <w:left w:type="dxa" w:w="100"/>
+              <w:bottom w:type="dxa" w:w="60"/>
+              <w:right w:type="dxa" w:w="100"/>
+            </w:tcMar>
+          </w:tcPr>
+          <w:p>
+            <w:pPr>
+              <w:spacing w:after="0" w:line="252"/>
+            </w:pPr>
+            <w:r>
+              <w:rPr>
+                <w:rFonts w:ascii="Calibri" w:cs="Calibri" w:eastAsia="Calibri" w:hAnsi="Calibri"/>
+                <w:color w:val="1F2937"/>
+                <w:sz w:val="19"/>
+                <w:szCs w:val="19"/>
+              </w:rPr>
+              <w:t xml:space="preserve">sharp</w:t>
+            </w:r>
+          </w:p>
+        </w:tc>
+        <w:tc>
+          <w:tcPr>
+            <w:tcW w:type="dxa" w:w="2500"/>
+            <w:tcBorders>
+              <w:top w:val="single" w:color="C9D3E3" w:sz="4"/>
+              <w:left w:val="single" w:color="C9D3E3" w:sz="4"/>
+              <w:bottom w:val="single" w:color="C9D3E3" w:sz="4"/>
+              <w:right w:val="single" w:color="C9D3E3" w:sz="4"/>
+            </w:tcBorders>
+            <w:shd w:fill="F3F6FC" w:color="auto" w:val="clear"/>
+            <w:tcMar>
+              <w:top w:type="dxa" w:w="60"/>
+              <w:left w:type="dxa" w:w="100"/>
+              <w:bottom w:type="dxa" w:w="60"/>
+              <w:right w:type="dxa" w:w="100"/>
+            </w:tcMar>
+          </w:tcPr>
+          <w:p>
+            <w:pPr>
+              <w:spacing w:after="0" w:line="252"/>
+            </w:pPr>
+            <w:r>
+              <w:rPr>
+                <w:rFonts w:ascii="Calibri" w:cs="Calibri" w:eastAsia="Calibri" w:hAnsi="Calibri"/>
+                <w:color w:val="1F2937"/>
+                <w:sz w:val="19"/>
+                <w:szCs w:val="19"/>
+              </w:rPr>
+              <w:t xml:space="preserve">0.35.5</w:t>
+            </w:r>
+          </w:p>
+        </w:tc>
+        <w:tc>
+          <w:tcPr>
+            <w:tcW w:type="dxa" w:w="3400"/>
+            <w:tcBorders>
+              <w:top w:val="single" w:color="C9D3E3" w:sz="4"/>
+              <w:left w:val="single" w:color="C9D3E3" w:sz="4"/>
+              <w:bottom w:val="single" w:color="C9D3E3" w:sz="4"/>
+              <w:right w:val="single" w:color="C9D3E3" w:sz="4"/>
+            </w:tcBorders>
+            <w:shd w:fill="F3F6FC" w:color="auto" w:val="clear"/>
+            <w:tcMar>
+              <w:top w:type="dxa" w:w="60"/>
+              <w:left w:type="dxa" w:w="100"/>
+              <w:bottom w:type="dxa" w:w="60"/>
+              <w:right w:type="dxa" w:w="100"/>
+            </w:tcMar>
+          </w:tcPr>
+          <w:p>
+            <w:pPr>
+              <w:spacing w:after="0" w:line="252"/>
+            </w:pPr>
+            <w:r>
+              <w:rPr>
+                <w:rFonts w:ascii="Calibri" w:cs="Calibri" w:eastAsia="Calibri" w:hAnsi="Calibri"/>
+                <w:color w:val="1F2937"/>
+                <w:sz w:val="19"/>
+                <w:szCs w:val="19"/>
+              </w:rPr>
+              <w:t xml:space="preserve">Image processing for </w:t>
+            </w:r>
+            <w:r>
+              <w:rPr>
+                <w:rFonts w:ascii="Courier New" w:cs="Courier New" w:eastAsia="Courier New" w:hAnsi="Courier New"/>
+                <w:color w:val="1F2937"/>
+                <w:sz w:val="18"/>
+                <w:szCs w:val="18"/>
+                <w:shd w:fill="EEF1F6" w:color="auto" w:val="clear"/>
+              </w:rPr>
+              <w:t xml:space="preserve">npm run images</w:t>
+            </w:r>
+            <w:r>
+              <w:rPr>
+                <w:rFonts w:ascii="Calibri" w:cs="Calibri" w:eastAsia="Calibri" w:hAnsi="Calibri"/>
+                <w:color w:val="1F2937"/>
+                <w:sz w:val="19"/>
+                <w:szCs w:val="19"/>
+              </w:rPr>
+              <w:t xml:space="preserve">; 0.34 ships image libraries with known vulnerabilities</w:t>
             </w:r>
           </w:p>
         </w:tc>
@@ -21418,6 +21736,1163 @@
     </w:p>
     <w:p>
       <w:pPr>
+        <w:pStyle w:val="Heading2"/>
+        <w:keepNext/>
+        <w:numPr>
+          <w:ilvl w:val="1"/>
+          <w:numId w:val="2"/>
+        </w:numPr>
+      </w:pPr>
+      <w:r>
+        <w:rPr>
+          <w:rFonts w:ascii="Calibri" w:cs="Calibri" w:eastAsia="Calibri" w:hAnsi="Calibri"/>
+        </w:rPr>
+        <w:t xml:space="preserve">Image optimization</w:t>
+      </w:r>
+    </w:p>
+    <w:p>
+      <w:pPr>
+        <w:spacing w:after="120" w:line="276"/>
+      </w:pPr>
+      <w:r>
+        <w:rPr>
+          <w:rFonts w:ascii="Courier New" w:cs="Courier New" w:eastAsia="Courier New" w:hAnsi="Courier New"/>
+          <w:color w:val="1F2937"/>
+          <w:sz w:val="18"/>
+          <w:szCs w:val="18"/>
+          <w:shd w:fill="EEF1F6" w:color="auto" w:val="clear"/>
+        </w:rPr>
+        <w:t xml:space="preserve">npm run images</w:t>
+      </w:r>
+      <w:r>
+        <w:rPr>
+          <w:rFonts w:ascii="Calibri" w:cs="Calibri" w:eastAsia="Calibri" w:hAnsi="Calibri"/>
+          <w:color w:val="1F2937"/>
+        </w:rPr>
+        <w:t xml:space="preserve"> (</w:t>
+      </w:r>
+      <w:r>
+        <w:rPr>
+          <w:rFonts w:ascii="Courier New" w:cs="Courier New" w:eastAsia="Courier New" w:hAnsi="Courier New"/>
+          <w:color w:val="1F2937"/>
+          <w:sz w:val="18"/>
+          <w:szCs w:val="18"/>
+          <w:shd w:fill="EEF1F6" w:color="auto" w:val="clear"/>
+        </w:rPr>
+        <w:t xml:space="preserve">scripts/optimize-images.mjs</w:t>
+      </w:r>
+      <w:r>
+        <w:rPr>
+          <w:rFonts w:ascii="Calibri" w:cs="Calibri" w:eastAsia="Calibri" w:hAnsi="Calibri"/>
+          <w:color w:val="1F2937"/>
+        </w:rPr>
+        <w:t xml:space="preserve">) turns every PNG, JPG, GIF, TIFF or AVIF in </w:t>
+      </w:r>
+      <w:r>
+        <w:rPr>
+          <w:rFonts w:ascii="Courier New" w:cs="Courier New" w:eastAsia="Courier New" w:hAnsi="Courier New"/>
+          <w:color w:val="1F2937"/>
+          <w:sz w:val="18"/>
+          <w:szCs w:val="18"/>
+          <w:shd w:fill="EEF1F6" w:color="auto" w:val="clear"/>
+        </w:rPr>
+        <w:t xml:space="preserve">public/assets/images</w:t>
+      </w:r>
+      <w:r>
+        <w:rPr>
+          <w:rFonts w:ascii="Calibri" w:cs="Calibri" w:eastAsia="Calibri" w:hAnsi="Calibri"/>
+          <w:color w:val="1F2937"/>
+        </w:rPr>
+        <w:t xml:space="preserve"> into a WebP sized for where it is shown, using </w:t>
+      </w:r>
+      <w:r>
+        <w:rPr>
+          <w:rFonts w:ascii="Calibri" w:cs="Calibri" w:eastAsia="Calibri" w:hAnsi="Calibri"/>
+          <w:b/>
+          <w:bCs/>
+          <w:color w:val="1F2937"/>
+        </w:rPr>
+        <w:t xml:space="preserve">sharp</w:t>
+      </w:r>
+      <w:r>
+        <w:rPr>
+          <w:rFonts w:ascii="Calibri" w:cs="Calibri" w:eastAsia="Calibri" w:hAnsi="Calibri"/>
+          <w:color w:val="1F2937"/>
+        </w:rPr>
+        <w:t xml:space="preserve">, and deletes the original once the WebP is written. Photos are first rotated according to their EXIF orientation, so phone screenshots come out upright.</w:t>
+      </w:r>
+    </w:p>
+    <w:tbl>
+      <w:tblPr>
+        <w:tblW w:type="dxa" w:w="8600"/>
+        <w:tblInd w:type="dxa" w:w="720"/>
+        <w:tblBorders>
+          <w:top w:val="single" w:color="auto" w:sz="4"/>
+          <w:left w:val="single" w:color="auto" w:sz="4"/>
+          <w:bottom w:val="single" w:color="auto" w:sz="4"/>
+          <w:right w:val="single" w:color="auto" w:sz="4"/>
+          <w:insideH w:val="single" w:color="auto" w:sz="4"/>
+          <w:insideV w:val="single" w:color="auto" w:sz="4"/>
+        </w:tblBorders>
+      </w:tblPr>
+      <w:tblGrid>
+        <w:gridCol w:w="2700"/>
+        <w:gridCol w:w="2500"/>
+        <w:gridCol w:w="3400"/>
+      </w:tblGrid>
+      <w:tr>
+        <w:trPr>
+          <w:cantSplit/>
+          <w:tblHeader/>
+        </w:trPr>
+        <w:tc>
+          <w:tcPr>
+            <w:tcW w:type="dxa" w:w="2700"/>
+            <w:tcBorders>
+              <w:top w:val="single" w:color="C9D3E3" w:sz="4"/>
+              <w:left w:val="single" w:color="C9D3E3" w:sz="4"/>
+              <w:bottom w:val="single" w:color="C9D3E3" w:sz="4"/>
+              <w:right w:val="single" w:color="C9D3E3" w:sz="4"/>
+            </w:tcBorders>
+            <w:shd w:fill="1F3A6E" w:color="auto" w:val="clear"/>
+            <w:tcMar>
+              <w:top w:type="dxa" w:w="60"/>
+              <w:left w:type="dxa" w:w="100"/>
+              <w:bottom w:type="dxa" w:w="60"/>
+              <w:right w:type="dxa" w:w="100"/>
+            </w:tcMar>
+          </w:tcPr>
+          <w:p>
+            <w:pPr>
+              <w:spacing w:after="0" w:line="252"/>
+            </w:pPr>
+            <w:r>
+              <w:rPr>
+                <w:rFonts w:ascii="Calibri" w:cs="Calibri" w:eastAsia="Calibri" w:hAnsi="Calibri"/>
+                <w:b/>
+                <w:bCs/>
+                <w:color w:val="FFFFFF"/>
+                <w:sz w:val="19"/>
+                <w:szCs w:val="19"/>
+              </w:rPr>
+              <w:t xml:space="preserve">Folder</w:t>
+            </w:r>
+          </w:p>
+        </w:tc>
+        <w:tc>
+          <w:tcPr>
+            <w:tcW w:type="dxa" w:w="2500"/>
+            <w:tcBorders>
+              <w:top w:val="single" w:color="C9D3E3" w:sz="4"/>
+              <w:left w:val="single" w:color="C9D3E3" w:sz="4"/>
+              <w:bottom w:val="single" w:color="C9D3E3" w:sz="4"/>
+              <w:right w:val="single" w:color="C9D3E3" w:sz="4"/>
+            </w:tcBorders>
+            <w:shd w:fill="1F3A6E" w:color="auto" w:val="clear"/>
+            <w:tcMar>
+              <w:top w:type="dxa" w:w="60"/>
+              <w:left w:type="dxa" w:w="100"/>
+              <w:bottom w:type="dxa" w:w="60"/>
+              <w:right w:type="dxa" w:w="100"/>
+            </w:tcMar>
+          </w:tcPr>
+          <w:p>
+            <w:pPr>
+              <w:spacing w:after="0" w:line="252"/>
+            </w:pPr>
+            <w:r>
+              <w:rPr>
+                <w:rFonts w:ascii="Calibri" w:cs="Calibri" w:eastAsia="Calibri" w:hAnsi="Calibri"/>
+                <w:b/>
+                <w:bCs/>
+                <w:color w:val="FFFFFF"/>
+                <w:sz w:val="19"/>
+                <w:szCs w:val="19"/>
+              </w:rPr>
+              <w:t xml:space="preserve">Size</w:t>
+            </w:r>
+          </w:p>
+        </w:tc>
+        <w:tc>
+          <w:tcPr>
+            <w:tcW w:type="dxa" w:w="3400"/>
+            <w:tcBorders>
+              <w:top w:val="single" w:color="C9D3E3" w:sz="4"/>
+              <w:left w:val="single" w:color="C9D3E3" w:sz="4"/>
+              <w:bottom w:val="single" w:color="C9D3E3" w:sz="4"/>
+              <w:right w:val="single" w:color="C9D3E3" w:sz="4"/>
+            </w:tcBorders>
+            <w:shd w:fill="1F3A6E" w:color="auto" w:val="clear"/>
+            <w:tcMar>
+              <w:top w:type="dxa" w:w="60"/>
+              <w:left w:type="dxa" w:w="100"/>
+              <w:bottom w:type="dxa" w:w="60"/>
+              <w:right w:type="dxa" w:w="100"/>
+            </w:tcMar>
+          </w:tcPr>
+          <w:p>
+            <w:pPr>
+              <w:spacing w:after="0" w:line="252"/>
+            </w:pPr>
+            <w:r>
+              <w:rPr>
+                <w:rFonts w:ascii="Calibri" w:cs="Calibri" w:eastAsia="Calibri" w:hAnsi="Calibri"/>
+                <w:b/>
+                <w:bCs/>
+                <w:color w:val="FFFFFF"/>
+                <w:sz w:val="19"/>
+                <w:szCs w:val="19"/>
+              </w:rPr>
+              <w:t xml:space="preserve">WebP quality</w:t>
+            </w:r>
+          </w:p>
+        </w:tc>
+      </w:tr>
+      <w:tr>
+        <w:trPr>
+          <w:cantSplit/>
+        </w:trPr>
+        <w:tc>
+          <w:tcPr>
+            <w:tcW w:type="dxa" w:w="2700"/>
+            <w:tcBorders>
+              <w:top w:val="single" w:color="C9D3E3" w:sz="4"/>
+              <w:left w:val="single" w:color="C9D3E3" w:sz="4"/>
+              <w:bottom w:val="single" w:color="C9D3E3" w:sz="4"/>
+              <w:right w:val="single" w:color="C9D3E3" w:sz="4"/>
+            </w:tcBorders>
+            <w:shd w:fill="EEF1F6" w:color="auto" w:val="clear"/>
+            <w:tcMar>
+              <w:top w:type="dxa" w:w="60"/>
+              <w:left w:type="dxa" w:w="100"/>
+              <w:bottom w:type="dxa" w:w="60"/>
+              <w:right w:type="dxa" w:w="100"/>
+            </w:tcMar>
+          </w:tcPr>
+          <w:p>
+            <w:pPr>
+              <w:spacing w:after="0" w:line="252"/>
+            </w:pPr>
+            <w:r>
+              <w:rPr>
+                <w:rFonts w:ascii="Courier New" w:cs="Courier New" w:eastAsia="Courier New" w:hAnsi="Courier New"/>
+                <w:color w:val="1F2937"/>
+                <w:sz w:val="18"/>
+                <w:szCs w:val="18"/>
+                <w:shd w:fill="EEF1F6" w:color="auto" w:val="clear"/>
+              </w:rPr>
+              <w:t xml:space="preserve">system/apps/</w:t>
+            </w:r>
+          </w:p>
+        </w:tc>
+        <w:tc>
+          <w:tcPr>
+            <w:tcW w:type="dxa" w:w="2500"/>
+            <w:tcBorders>
+              <w:top w:val="single" w:color="C9D3E3" w:sz="4"/>
+              <w:left w:val="single" w:color="C9D3E3" w:sz="4"/>
+              <w:bottom w:val="single" w:color="C9D3E3" w:sz="4"/>
+              <w:right w:val="single" w:color="C9D3E3" w:sz="4"/>
+            </w:tcBorders>
+            <w:shd w:fill="EEF1F6" w:color="auto" w:val="clear"/>
+            <w:tcMar>
+              <w:top w:type="dxa" w:w="60"/>
+              <w:left w:type="dxa" w:w="100"/>
+              <w:bottom w:type="dxa" w:w="60"/>
+              <w:right w:type="dxa" w:w="100"/>
+            </w:tcMar>
+          </w:tcPr>
+          <w:p>
+            <w:pPr>
+              <w:spacing w:after="0" w:line="252"/>
+            </w:pPr>
+            <w:r>
+              <w:rPr>
+                <w:rFonts w:ascii="Calibri" w:cs="Calibri" w:eastAsia="Calibri" w:hAnsi="Calibri"/>
+                <w:color w:val="1F2937"/>
+                <w:sz w:val="19"/>
+                <w:szCs w:val="19"/>
+              </w:rPr>
+              <w:t xml:space="preserve">Up to 144 × 144 px</w:t>
+            </w:r>
+          </w:p>
+        </w:tc>
+        <w:tc>
+          <w:tcPr>
+            <w:tcW w:type="dxa" w:w="3400"/>
+            <w:tcBorders>
+              <w:top w:val="single" w:color="C9D3E3" w:sz="4"/>
+              <w:left w:val="single" w:color="C9D3E3" w:sz="4"/>
+              <w:bottom w:val="single" w:color="C9D3E3" w:sz="4"/>
+              <w:right w:val="single" w:color="C9D3E3" w:sz="4"/>
+            </w:tcBorders>
+            <w:shd w:fill="EEF1F6" w:color="auto" w:val="clear"/>
+            <w:tcMar>
+              <w:top w:type="dxa" w:w="60"/>
+              <w:left w:type="dxa" w:w="100"/>
+              <w:bottom w:type="dxa" w:w="60"/>
+              <w:right w:type="dxa" w:w="100"/>
+            </w:tcMar>
+          </w:tcPr>
+          <w:p>
+            <w:pPr>
+              <w:spacing w:after="0" w:line="252"/>
+            </w:pPr>
+            <w:r>
+              <w:rPr>
+                <w:rFonts w:ascii="Calibri" w:cs="Calibri" w:eastAsia="Calibri" w:hAnsi="Calibri"/>
+                <w:color w:val="1F2937"/>
+                <w:sz w:val="19"/>
+                <w:szCs w:val="19"/>
+              </w:rPr>
+              <w:t xml:space="preserve">90</w:t>
+            </w:r>
+          </w:p>
+        </w:tc>
+      </w:tr>
+      <w:tr>
+        <w:trPr>
+          <w:cantSplit/>
+        </w:trPr>
+        <w:tc>
+          <w:tcPr>
+            <w:tcW w:type="dxa" w:w="2700"/>
+            <w:tcBorders>
+              <w:top w:val="single" w:color="C9D3E3" w:sz="4"/>
+              <w:left w:val="single" w:color="C9D3E3" w:sz="4"/>
+              <w:bottom w:val="single" w:color="C9D3E3" w:sz="4"/>
+              <w:right w:val="single" w:color="C9D3E3" w:sz="4"/>
+            </w:tcBorders>
+            <w:shd w:fill="F3F6FC" w:color="auto" w:val="clear"/>
+            <w:tcMar>
+              <w:top w:type="dxa" w:w="60"/>
+              <w:left w:type="dxa" w:w="100"/>
+              <w:bottom w:type="dxa" w:w="60"/>
+              <w:right w:type="dxa" w:w="100"/>
+            </w:tcMar>
+          </w:tcPr>
+          <w:p>
+            <w:pPr>
+              <w:spacing w:after="0" w:line="252"/>
+            </w:pPr>
+            <w:r>
+              <w:rPr>
+                <w:rFonts w:ascii="Courier New" w:cs="Courier New" w:eastAsia="Courier New" w:hAnsi="Courier New"/>
+                <w:color w:val="1F2937"/>
+                <w:sz w:val="18"/>
+                <w:szCs w:val="18"/>
+                <w:shd w:fill="EEF1F6" w:color="auto" w:val="clear"/>
+              </w:rPr>
+              <w:t xml:space="preserve">system/background_xp.*</w:t>
+            </w:r>
+          </w:p>
+        </w:tc>
+        <w:tc>
+          <w:tcPr>
+            <w:tcW w:type="dxa" w:w="2500"/>
+            <w:tcBorders>
+              <w:top w:val="single" w:color="C9D3E3" w:sz="4"/>
+              <w:left w:val="single" w:color="C9D3E3" w:sz="4"/>
+              <w:bottom w:val="single" w:color="C9D3E3" w:sz="4"/>
+              <w:right w:val="single" w:color="C9D3E3" w:sz="4"/>
+            </w:tcBorders>
+            <w:shd w:fill="F3F6FC" w:color="auto" w:val="clear"/>
+            <w:tcMar>
+              <w:top w:type="dxa" w:w="60"/>
+              <w:left w:type="dxa" w:w="100"/>
+              <w:bottom w:type="dxa" w:w="60"/>
+              <w:right w:type="dxa" w:w="100"/>
+            </w:tcMar>
+          </w:tcPr>
+          <w:p>
+            <w:pPr>
+              <w:spacing w:after="0" w:line="252"/>
+            </w:pPr>
+            <w:r>
+              <w:rPr>
+                <w:rFonts w:ascii="Calibri" w:cs="Calibri" w:eastAsia="Calibri" w:hAnsi="Calibri"/>
+                <w:color w:val="1F2937"/>
+                <w:sz w:val="19"/>
+                <w:szCs w:val="19"/>
+              </w:rPr>
+              <w:t xml:space="preserve">2560 px wide</w:t>
+            </w:r>
+          </w:p>
+        </w:tc>
+        <w:tc>
+          <w:tcPr>
+            <w:tcW w:type="dxa" w:w="3400"/>
+            <w:tcBorders>
+              <w:top w:val="single" w:color="C9D3E3" w:sz="4"/>
+              <w:left w:val="single" w:color="C9D3E3" w:sz="4"/>
+              <w:bottom w:val="single" w:color="C9D3E3" w:sz="4"/>
+              <w:right w:val="single" w:color="C9D3E3" w:sz="4"/>
+            </w:tcBorders>
+            <w:shd w:fill="F3F6FC" w:color="auto" w:val="clear"/>
+            <w:tcMar>
+              <w:top w:type="dxa" w:w="60"/>
+              <w:left w:type="dxa" w:w="100"/>
+              <w:bottom w:type="dxa" w:w="60"/>
+              <w:right w:type="dxa" w:w="100"/>
+            </w:tcMar>
+          </w:tcPr>
+          <w:p>
+            <w:pPr>
+              <w:spacing w:after="0" w:line="252"/>
+            </w:pPr>
+            <w:r>
+              <w:rPr>
+                <w:rFonts w:ascii="Calibri" w:cs="Calibri" w:eastAsia="Calibri" w:hAnsi="Calibri"/>
+                <w:color w:val="1F2937"/>
+                <w:sz w:val="19"/>
+                <w:szCs w:val="19"/>
+              </w:rPr>
+              <w:t xml:space="preserve">78</w:t>
+            </w:r>
+          </w:p>
+        </w:tc>
+      </w:tr>
+      <w:tr>
+        <w:trPr>
+          <w:cantSplit/>
+        </w:trPr>
+        <w:tc>
+          <w:tcPr>
+            <w:tcW w:type="dxa" w:w="2700"/>
+            <w:tcBorders>
+              <w:top w:val="single" w:color="C9D3E3" w:sz="4"/>
+              <w:left w:val="single" w:color="C9D3E3" w:sz="4"/>
+              <w:bottom w:val="single" w:color="C9D3E3" w:sz="4"/>
+              <w:right w:val="single" w:color="C9D3E3" w:sz="4"/>
+            </w:tcBorders>
+            <w:shd w:fill="EEF1F6" w:color="auto" w:val="clear"/>
+            <w:tcMar>
+              <w:top w:type="dxa" w:w="60"/>
+              <w:left w:type="dxa" w:w="100"/>
+              <w:bottom w:type="dxa" w:w="60"/>
+              <w:right w:type="dxa" w:w="100"/>
+            </w:tcMar>
+          </w:tcPr>
+          <w:p>
+            <w:pPr>
+              <w:spacing w:after="0" w:line="252"/>
+            </w:pPr>
+            <w:r>
+              <w:rPr>
+                <w:rFonts w:ascii="Courier New" w:cs="Courier New" w:eastAsia="Courier New" w:hAnsi="Courier New"/>
+                <w:color w:val="1F2937"/>
+                <w:sz w:val="18"/>
+                <w:szCs w:val="18"/>
+                <w:shd w:fill="EEF1F6" w:color="auto" w:val="clear"/>
+              </w:rPr>
+              <w:t xml:space="preserve">system/logo_xp.*</w:t>
+            </w:r>
+          </w:p>
+        </w:tc>
+        <w:tc>
+          <w:tcPr>
+            <w:tcW w:type="dxa" w:w="2500"/>
+            <w:tcBorders>
+              <w:top w:val="single" w:color="C9D3E3" w:sz="4"/>
+              <w:left w:val="single" w:color="C9D3E3" w:sz="4"/>
+              <w:bottom w:val="single" w:color="C9D3E3" w:sz="4"/>
+              <w:right w:val="single" w:color="C9D3E3" w:sz="4"/>
+            </w:tcBorders>
+            <w:shd w:fill="EEF1F6" w:color="auto" w:val="clear"/>
+            <w:tcMar>
+              <w:top w:type="dxa" w:w="60"/>
+              <w:left w:type="dxa" w:w="100"/>
+              <w:bottom w:type="dxa" w:w="60"/>
+              <w:right w:type="dxa" w:w="100"/>
+            </w:tcMar>
+          </w:tcPr>
+          <w:p>
+            <w:pPr>
+              <w:spacing w:after="0" w:line="252"/>
+            </w:pPr>
+            <w:r>
+              <w:rPr>
+                <w:rFonts w:ascii="Calibri" w:cs="Calibri" w:eastAsia="Calibri" w:hAnsi="Calibri"/>
+                <w:color w:val="1F2937"/>
+                <w:sz w:val="19"/>
+                <w:szCs w:val="19"/>
+              </w:rPr>
+              <w:t xml:space="preserve">440 px wide</w:t>
+            </w:r>
+          </w:p>
+        </w:tc>
+        <w:tc>
+          <w:tcPr>
+            <w:tcW w:type="dxa" w:w="3400"/>
+            <w:tcBorders>
+              <w:top w:val="single" w:color="C9D3E3" w:sz="4"/>
+              <w:left w:val="single" w:color="C9D3E3" w:sz="4"/>
+              <w:bottom w:val="single" w:color="C9D3E3" w:sz="4"/>
+              <w:right w:val="single" w:color="C9D3E3" w:sz="4"/>
+            </w:tcBorders>
+            <w:shd w:fill="EEF1F6" w:color="auto" w:val="clear"/>
+            <w:tcMar>
+              <w:top w:type="dxa" w:w="60"/>
+              <w:left w:type="dxa" w:w="100"/>
+              <w:bottom w:type="dxa" w:w="60"/>
+              <w:right w:type="dxa" w:w="100"/>
+            </w:tcMar>
+          </w:tcPr>
+          <w:p>
+            <w:pPr>
+              <w:spacing w:after="0" w:line="252"/>
+            </w:pPr>
+            <w:r>
+              <w:rPr>
+                <w:rFonts w:ascii="Calibri" w:cs="Calibri" w:eastAsia="Calibri" w:hAnsi="Calibri"/>
+                <w:color w:val="1F2937"/>
+                <w:sz w:val="19"/>
+                <w:szCs w:val="19"/>
+              </w:rPr>
+              <w:t xml:space="preserve">90</w:t>
+            </w:r>
+          </w:p>
+        </w:tc>
+      </w:tr>
+      <w:tr>
+        <w:trPr>
+          <w:cantSplit/>
+        </w:trPr>
+        <w:tc>
+          <w:tcPr>
+            <w:tcW w:type="dxa" w:w="2700"/>
+            <w:tcBorders>
+              <w:top w:val="single" w:color="C9D3E3" w:sz="4"/>
+              <w:left w:val="single" w:color="C9D3E3" w:sz="4"/>
+              <w:bottom w:val="single" w:color="C9D3E3" w:sz="4"/>
+              <w:right w:val="single" w:color="C9D3E3" w:sz="4"/>
+            </w:tcBorders>
+            <w:shd w:fill="F3F6FC" w:color="auto" w:val="clear"/>
+            <w:tcMar>
+              <w:top w:type="dxa" w:w="60"/>
+              <w:left w:type="dxa" w:w="100"/>
+              <w:bottom w:type="dxa" w:w="60"/>
+              <w:right w:type="dxa" w:w="100"/>
+            </w:tcMar>
+          </w:tcPr>
+          <w:p>
+            <w:pPr>
+              <w:spacing w:after="0" w:line="252"/>
+            </w:pPr>
+            <w:r>
+              <w:rPr>
+                <w:rFonts w:ascii="Courier New" w:cs="Courier New" w:eastAsia="Courier New" w:hAnsi="Courier New"/>
+                <w:color w:val="1F2937"/>
+                <w:sz w:val="18"/>
+                <w:szCs w:val="18"/>
+                <w:shd w:fill="EEF1F6" w:color="auto" w:val="clear"/>
+              </w:rPr>
+              <w:t xml:space="preserve">system/avatar_xp.*</w:t>
+            </w:r>
+          </w:p>
+        </w:tc>
+        <w:tc>
+          <w:tcPr>
+            <w:tcW w:type="dxa" w:w="2500"/>
+            <w:tcBorders>
+              <w:top w:val="single" w:color="C9D3E3" w:sz="4"/>
+              <w:left w:val="single" w:color="C9D3E3" w:sz="4"/>
+              <w:bottom w:val="single" w:color="C9D3E3" w:sz="4"/>
+              <w:right w:val="single" w:color="C9D3E3" w:sz="4"/>
+            </w:tcBorders>
+            <w:shd w:fill="F3F6FC" w:color="auto" w:val="clear"/>
+            <w:tcMar>
+              <w:top w:type="dxa" w:w="60"/>
+              <w:left w:type="dxa" w:w="100"/>
+              <w:bottom w:type="dxa" w:w="60"/>
+              <w:right w:type="dxa" w:w="100"/>
+            </w:tcMar>
+          </w:tcPr>
+          <w:p>
+            <w:pPr>
+              <w:spacing w:after="0" w:line="252"/>
+            </w:pPr>
+            <w:r>
+              <w:rPr>
+                <w:rFonts w:ascii="Calibri" w:cs="Calibri" w:eastAsia="Calibri" w:hAnsi="Calibri"/>
+                <w:color w:val="1F2937"/>
+                <w:sz w:val="19"/>
+                <w:szCs w:val="19"/>
+              </w:rPr>
+              <w:t xml:space="preserve">Up to 256 × 256 px</w:t>
+            </w:r>
+          </w:p>
+        </w:tc>
+        <w:tc>
+          <w:tcPr>
+            <w:tcW w:type="dxa" w:w="3400"/>
+            <w:tcBorders>
+              <w:top w:val="single" w:color="C9D3E3" w:sz="4"/>
+              <w:left w:val="single" w:color="C9D3E3" w:sz="4"/>
+              <w:bottom w:val="single" w:color="C9D3E3" w:sz="4"/>
+              <w:right w:val="single" w:color="C9D3E3" w:sz="4"/>
+            </w:tcBorders>
+            <w:shd w:fill="F3F6FC" w:color="auto" w:val="clear"/>
+            <w:tcMar>
+              <w:top w:type="dxa" w:w="60"/>
+              <w:left w:type="dxa" w:w="100"/>
+              <w:bottom w:type="dxa" w:w="60"/>
+              <w:right w:type="dxa" w:w="100"/>
+            </w:tcMar>
+          </w:tcPr>
+          <w:p>
+            <w:pPr>
+              <w:spacing w:after="0" w:line="252"/>
+            </w:pPr>
+            <w:r>
+              <w:rPr>
+                <w:rFonts w:ascii="Calibri" w:cs="Calibri" w:eastAsia="Calibri" w:hAnsi="Calibri"/>
+                <w:color w:val="1F2937"/>
+                <w:sz w:val="19"/>
+                <w:szCs w:val="19"/>
+              </w:rPr>
+              <w:t xml:space="preserve">80</w:t>
+            </w:r>
+          </w:p>
+        </w:tc>
+      </w:tr>
+      <w:tr>
+        <w:trPr>
+          <w:cantSplit/>
+        </w:trPr>
+        <w:tc>
+          <w:tcPr>
+            <w:tcW w:type="dxa" w:w="2700"/>
+            <w:tcBorders>
+              <w:top w:val="single" w:color="C9D3E3" w:sz="4"/>
+              <w:left w:val="single" w:color="C9D3E3" w:sz="4"/>
+              <w:bottom w:val="single" w:color="C9D3E3" w:sz="4"/>
+              <w:right w:val="single" w:color="C9D3E3" w:sz="4"/>
+            </w:tcBorders>
+            <w:shd w:fill="EEF1F6" w:color="auto" w:val="clear"/>
+            <w:tcMar>
+              <w:top w:type="dxa" w:w="60"/>
+              <w:left w:type="dxa" w:w="100"/>
+              <w:bottom w:type="dxa" w:w="60"/>
+              <w:right w:type="dxa" w:w="100"/>
+            </w:tcMar>
+          </w:tcPr>
+          <w:p>
+            <w:pPr>
+              <w:spacing w:after="0" w:line="252"/>
+            </w:pPr>
+            <w:r>
+              <w:rPr>
+                <w:rFonts w:ascii="Courier New" w:cs="Courier New" w:eastAsia="Courier New" w:hAnsi="Courier New"/>
+                <w:color w:val="1F2937"/>
+                <w:sz w:val="18"/>
+                <w:szCs w:val="18"/>
+                <w:shd w:fill="EEF1F6" w:color="auto" w:val="clear"/>
+              </w:rPr>
+              <w:t xml:space="preserve">webs/</w:t>
+            </w:r>
+          </w:p>
+        </w:tc>
+        <w:tc>
+          <w:tcPr>
+            <w:tcW w:type="dxa" w:w="2500"/>
+            <w:tcBorders>
+              <w:top w:val="single" w:color="C9D3E3" w:sz="4"/>
+              <w:left w:val="single" w:color="C9D3E3" w:sz="4"/>
+              <w:bottom w:val="single" w:color="C9D3E3" w:sz="4"/>
+              <w:right w:val="single" w:color="C9D3E3" w:sz="4"/>
+            </w:tcBorders>
+            <w:shd w:fill="EEF1F6" w:color="auto" w:val="clear"/>
+            <w:tcMar>
+              <w:top w:type="dxa" w:w="60"/>
+              <w:left w:type="dxa" w:w="100"/>
+              <w:bottom w:type="dxa" w:w="60"/>
+              <w:right w:type="dxa" w:w="100"/>
+            </w:tcMar>
+          </w:tcPr>
+          <w:p>
+            <w:pPr>
+              <w:spacing w:after="0" w:line="252"/>
+            </w:pPr>
+            <w:r>
+              <w:rPr>
+                <w:rFonts w:ascii="Calibri" w:cs="Calibri" w:eastAsia="Calibri" w:hAnsi="Calibri"/>
+                <w:color w:val="1F2937"/>
+                <w:sz w:val="19"/>
+                <w:szCs w:val="19"/>
+              </w:rPr>
+              <w:t xml:space="preserve">1280 px wide</w:t>
+            </w:r>
+          </w:p>
+        </w:tc>
+        <w:tc>
+          <w:tcPr>
+            <w:tcW w:type="dxa" w:w="3400"/>
+            <w:tcBorders>
+              <w:top w:val="single" w:color="C9D3E3" w:sz="4"/>
+              <w:left w:val="single" w:color="C9D3E3" w:sz="4"/>
+              <w:bottom w:val="single" w:color="C9D3E3" w:sz="4"/>
+              <w:right w:val="single" w:color="C9D3E3" w:sz="4"/>
+            </w:tcBorders>
+            <w:shd w:fill="EEF1F6" w:color="auto" w:val="clear"/>
+            <w:tcMar>
+              <w:top w:type="dxa" w:w="60"/>
+              <w:left w:type="dxa" w:w="100"/>
+              <w:bottom w:type="dxa" w:w="60"/>
+              <w:right w:type="dxa" w:w="100"/>
+            </w:tcMar>
+          </w:tcPr>
+          <w:p>
+            <w:pPr>
+              <w:spacing w:after="0" w:line="252"/>
+            </w:pPr>
+            <w:r>
+              <w:rPr>
+                <w:rFonts w:ascii="Calibri" w:cs="Calibri" w:eastAsia="Calibri" w:hAnsi="Calibri"/>
+                <w:color w:val="1F2937"/>
+                <w:sz w:val="19"/>
+                <w:szCs w:val="19"/>
+              </w:rPr>
+              <w:t xml:space="preserve">80</w:t>
+            </w:r>
+          </w:p>
+        </w:tc>
+      </w:tr>
+      <w:tr>
+        <w:trPr>
+          <w:cantSplit/>
+        </w:trPr>
+        <w:tc>
+          <w:tcPr>
+            <w:tcW w:type="dxa" w:w="2700"/>
+            <w:tcBorders>
+              <w:top w:val="single" w:color="C9D3E3" w:sz="4"/>
+              <w:left w:val="single" w:color="C9D3E3" w:sz="4"/>
+              <w:bottom w:val="single" w:color="C9D3E3" w:sz="4"/>
+              <w:right w:val="single" w:color="C9D3E3" w:sz="4"/>
+            </w:tcBorders>
+            <w:shd w:fill="F3F6FC" w:color="auto" w:val="clear"/>
+            <w:tcMar>
+              <w:top w:type="dxa" w:w="60"/>
+              <w:left w:type="dxa" w:w="100"/>
+              <w:bottom w:type="dxa" w:w="60"/>
+              <w:right w:type="dxa" w:w="100"/>
+            </w:tcMar>
+          </w:tcPr>
+          <w:p>
+            <w:pPr>
+              <w:spacing w:after="0" w:line="252"/>
+            </w:pPr>
+            <w:r>
+              <w:rPr>
+                <w:rFonts w:ascii="Courier New" w:cs="Courier New" w:eastAsia="Courier New" w:hAnsi="Courier New"/>
+                <w:color w:val="1F2937"/>
+                <w:sz w:val="18"/>
+                <w:szCs w:val="18"/>
+                <w:shd w:fill="EEF1F6" w:color="auto" w:val="clear"/>
+              </w:rPr>
+              <w:t xml:space="preserve">mobile/</w:t>
+            </w:r>
+          </w:p>
+        </w:tc>
+        <w:tc>
+          <w:tcPr>
+            <w:tcW w:type="dxa" w:w="2500"/>
+            <w:tcBorders>
+              <w:top w:val="single" w:color="C9D3E3" w:sz="4"/>
+              <w:left w:val="single" w:color="C9D3E3" w:sz="4"/>
+              <w:bottom w:val="single" w:color="C9D3E3" w:sz="4"/>
+              <w:right w:val="single" w:color="C9D3E3" w:sz="4"/>
+            </w:tcBorders>
+            <w:shd w:fill="F3F6FC" w:color="auto" w:val="clear"/>
+            <w:tcMar>
+              <w:top w:type="dxa" w:w="60"/>
+              <w:left w:type="dxa" w:w="100"/>
+              <w:bottom w:type="dxa" w:w="60"/>
+              <w:right w:type="dxa" w:w="100"/>
+            </w:tcMar>
+          </w:tcPr>
+          <w:p>
+            <w:pPr>
+              <w:spacing w:after="0" w:line="252"/>
+            </w:pPr>
+            <w:r>
+              <w:rPr>
+                <w:rFonts w:ascii="Calibri" w:cs="Calibri" w:eastAsia="Calibri" w:hAnsi="Calibri"/>
+                <w:color w:val="1F2937"/>
+                <w:sz w:val="19"/>
+                <w:szCs w:val="19"/>
+              </w:rPr>
+              <w:t xml:space="preserve">Original size (for the zoom)</w:t>
+            </w:r>
+          </w:p>
+        </w:tc>
+        <w:tc>
+          <w:tcPr>
+            <w:tcW w:type="dxa" w:w="3400"/>
+            <w:tcBorders>
+              <w:top w:val="single" w:color="C9D3E3" w:sz="4"/>
+              <w:left w:val="single" w:color="C9D3E3" w:sz="4"/>
+              <w:bottom w:val="single" w:color="C9D3E3" w:sz="4"/>
+              <w:right w:val="single" w:color="C9D3E3" w:sz="4"/>
+            </w:tcBorders>
+            <w:shd w:fill="F3F6FC" w:color="auto" w:val="clear"/>
+            <w:tcMar>
+              <w:top w:type="dxa" w:w="60"/>
+              <w:left w:type="dxa" w:w="100"/>
+              <w:bottom w:type="dxa" w:w="60"/>
+              <w:right w:type="dxa" w:w="100"/>
+            </w:tcMar>
+          </w:tcPr>
+          <w:p>
+            <w:pPr>
+              <w:spacing w:after="0" w:line="252"/>
+            </w:pPr>
+            <w:r>
+              <w:rPr>
+                <w:rFonts w:ascii="Calibri" w:cs="Calibri" w:eastAsia="Calibri" w:hAnsi="Calibri"/>
+                <w:color w:val="1F2937"/>
+                <w:sz w:val="19"/>
+                <w:szCs w:val="19"/>
+              </w:rPr>
+              <w:t xml:space="preserve">80</w:t>
+            </w:r>
+          </w:p>
+        </w:tc>
+      </w:tr>
+      <w:tr>
+        <w:trPr>
+          <w:cantSplit/>
+        </w:trPr>
+        <w:tc>
+          <w:tcPr>
+            <w:tcW w:type="dxa" w:w="2700"/>
+            <w:tcBorders>
+              <w:top w:val="single" w:color="C9D3E3" w:sz="4"/>
+              <w:left w:val="single" w:color="C9D3E3" w:sz="4"/>
+              <w:bottom w:val="single" w:color="C9D3E3" w:sz="4"/>
+              <w:right w:val="single" w:color="C9D3E3" w:sz="4"/>
+            </w:tcBorders>
+            <w:shd w:fill="EEF1F6" w:color="auto" w:val="clear"/>
+            <w:tcMar>
+              <w:top w:type="dxa" w:w="60"/>
+              <w:left w:type="dxa" w:w="100"/>
+              <w:bottom w:type="dxa" w:w="60"/>
+              <w:right w:type="dxa" w:w="100"/>
+            </w:tcMar>
+          </w:tcPr>
+          <w:p>
+            <w:pPr>
+              <w:spacing w:after="0" w:line="252"/>
+            </w:pPr>
+            <w:r>
+              <w:rPr>
+                <w:rFonts w:ascii="Calibri" w:cs="Calibri" w:eastAsia="Calibri" w:hAnsi="Calibri"/>
+                <w:color w:val="1F2937"/>
+                <w:sz w:val="19"/>
+                <w:szCs w:val="19"/>
+              </w:rPr>
+              <w:t xml:space="preserve">Anywhere else</w:t>
+            </w:r>
+          </w:p>
+        </w:tc>
+        <w:tc>
+          <w:tcPr>
+            <w:tcW w:type="dxa" w:w="2500"/>
+            <w:tcBorders>
+              <w:top w:val="single" w:color="C9D3E3" w:sz="4"/>
+              <w:left w:val="single" w:color="C9D3E3" w:sz="4"/>
+              <w:bottom w:val="single" w:color="C9D3E3" w:sz="4"/>
+              <w:right w:val="single" w:color="C9D3E3" w:sz="4"/>
+            </w:tcBorders>
+            <w:shd w:fill="EEF1F6" w:color="auto" w:val="clear"/>
+            <w:tcMar>
+              <w:top w:type="dxa" w:w="60"/>
+              <w:left w:type="dxa" w:w="100"/>
+              <w:bottom w:type="dxa" w:w="60"/>
+              <w:right w:type="dxa" w:w="100"/>
+            </w:tcMar>
+          </w:tcPr>
+          <w:p>
+            <w:pPr>
+              <w:spacing w:after="0" w:line="252"/>
+            </w:pPr>
+            <w:r>
+              <w:rPr>
+                <w:rFonts w:ascii="Calibri" w:cs="Calibri" w:eastAsia="Calibri" w:hAnsi="Calibri"/>
+                <w:color w:val="1F2937"/>
+                <w:sz w:val="19"/>
+                <w:szCs w:val="19"/>
+              </w:rPr>
+              <w:t xml:space="preserve">Up to 1920 px wide</w:t>
+            </w:r>
+          </w:p>
+        </w:tc>
+        <w:tc>
+          <w:tcPr>
+            <w:tcW w:type="dxa" w:w="3400"/>
+            <w:tcBorders>
+              <w:top w:val="single" w:color="C9D3E3" w:sz="4"/>
+              <w:left w:val="single" w:color="C9D3E3" w:sz="4"/>
+              <w:bottom w:val="single" w:color="C9D3E3" w:sz="4"/>
+              <w:right w:val="single" w:color="C9D3E3" w:sz="4"/>
+            </w:tcBorders>
+            <w:shd w:fill="EEF1F6" w:color="auto" w:val="clear"/>
+            <w:tcMar>
+              <w:top w:type="dxa" w:w="60"/>
+              <w:left w:type="dxa" w:w="100"/>
+              <w:bottom w:type="dxa" w:w="60"/>
+              <w:right w:type="dxa" w:w="100"/>
+            </w:tcMar>
+          </w:tcPr>
+          <w:p>
+            <w:pPr>
+              <w:spacing w:after="0" w:line="252"/>
+            </w:pPr>
+            <w:r>
+              <w:rPr>
+                <w:rFonts w:ascii="Calibri" w:cs="Calibri" w:eastAsia="Calibri" w:hAnsi="Calibri"/>
+                <w:color w:val="1F2937"/>
+                <w:sz w:val="19"/>
+                <w:szCs w:val="19"/>
+              </w:rPr>
+              <w:t xml:space="preserve">80</w:t>
+            </w:r>
+          </w:p>
+        </w:tc>
+      </w:tr>
+    </w:tbl>
+    <w:p>
+      <w:pPr>
+        <w:spacing w:after="120"/>
+      </w:pPr>
+    </w:p>
+    <w:p>
+      <w:pPr>
+        <w:pStyle w:val="ListParagraph"/>
+        <w:numPr>
+          <w:ilvl w:val="0"/>
+          <w:numId w:val="3"/>
+        </w:numPr>
+        <w:spacing w:after="60" w:line="264"/>
+      </w:pPr>
+      <w:r>
+        <w:rPr>
+          <w:rFonts w:ascii="Calibri" w:cs="Calibri" w:eastAsia="Calibri" w:hAnsi="Calibri"/>
+          <w:color w:val="1F2937"/>
+        </w:rPr>
+        <w:t xml:space="preserve">Images are only reduced, never enlarged.</w:t>
+      </w:r>
+    </w:p>
+    <w:p>
+      <w:pPr>
+        <w:pStyle w:val="ListParagraph"/>
+        <w:numPr>
+          <w:ilvl w:val="0"/>
+          <w:numId w:val="3"/>
+        </w:numPr>
+        <w:spacing w:after="60" w:line="264"/>
+      </w:pPr>
+      <w:r>
+        <w:rPr>
+          <w:rFonts w:ascii="Calibri" w:cs="Calibri" w:eastAsia="Calibri" w:hAnsi="Calibri"/>
+          <w:color w:val="1F2937"/>
+        </w:rPr>
+        <w:t xml:space="preserve">A file with the same name as an existing </w:t>
+      </w:r>
+      <w:r>
+        <w:rPr>
+          <w:rFonts w:ascii="Courier New" w:cs="Courier New" w:eastAsia="Courier New" w:hAnsi="Courier New"/>
+          <w:color w:val="1F2937"/>
+          <w:sz w:val="18"/>
+          <w:szCs w:val="18"/>
+          <w:shd w:fill="EEF1F6" w:color="auto" w:val="clear"/>
+        </w:rPr>
+        <w:t xml:space="preserve">.webp</w:t>
+      </w:r>
+      <w:r>
+        <w:rPr>
+          <w:rFonts w:ascii="Calibri" w:cs="Calibri" w:eastAsia="Calibri" w:hAnsi="Calibri"/>
+          <w:color w:val="1F2937"/>
+        </w:rPr>
+        <w:t xml:space="preserve"> replaces it (</w:t>
+      </w:r>
+      <w:r>
+        <w:rPr>
+          <w:rFonts w:ascii="Courier New" w:cs="Courier New" w:eastAsia="Courier New" w:hAnsi="Courier New"/>
+          <w:color w:val="1F2937"/>
+          <w:sz w:val="18"/>
+          <w:szCs w:val="18"/>
+          <w:shd w:fill="EEF1F6" w:color="auto" w:val="clear"/>
+        </w:rPr>
+        <w:t xml:space="preserve">project1.png</w:t>
+      </w:r>
+      <w:r>
+        <w:rPr>
+          <w:rFonts w:ascii="Calibri" w:cs="Calibri" w:eastAsia="Calibri" w:hAnsi="Calibri"/>
+          <w:color w:val="1F2937"/>
+        </w:rPr>
+        <w:t xml:space="preserve"> replaces </w:t>
+      </w:r>
+      <w:r>
+        <w:rPr>
+          <w:rFonts w:ascii="Courier New" w:cs="Courier New" w:eastAsia="Courier New" w:hAnsi="Courier New"/>
+          <w:color w:val="1F2937"/>
+          <w:sz w:val="18"/>
+          <w:szCs w:val="18"/>
+          <w:shd w:fill="EEF1F6" w:color="auto" w:val="clear"/>
+        </w:rPr>
+        <w:t xml:space="preserve">project1.webp</w:t>
+      </w:r>
+      <w:r>
+        <w:rPr>
+          <w:rFonts w:ascii="Calibri" w:cs="Calibri" w:eastAsia="Calibri" w:hAnsi="Calibri"/>
+          <w:color w:val="1F2937"/>
+        </w:rPr>
+        <w:t xml:space="preserve">), so the data files do not change.</w:t>
+      </w:r>
+    </w:p>
+    <w:p>
+      <w:pPr>
+        <w:pStyle w:val="ListParagraph"/>
+        <w:numPr>
+          <w:ilvl w:val="0"/>
+          <w:numId w:val="3"/>
+        </w:numPr>
+        <w:spacing w:after="60" w:line="264"/>
+      </w:pPr>
+      <w:r>
+        <w:rPr>
+          <w:rFonts w:ascii="Courier New" w:cs="Courier New" w:eastAsia="Courier New" w:hAnsi="Courier New"/>
+          <w:color w:val="1F2937"/>
+          <w:sz w:val="18"/>
+          <w:szCs w:val="18"/>
+          <w:shd w:fill="EEF1F6" w:color="auto" w:val="clear"/>
+        </w:rPr>
+        <w:t xml:space="preserve">system/favicon-32.png</w:t>
+      </w:r>
+      <w:r>
+        <w:rPr>
+          <w:rFonts w:ascii="Calibri" w:cs="Calibri" w:eastAsia="Calibri" w:hAnsi="Calibri"/>
+          <w:color w:val="1F2937"/>
+        </w:rPr>
+        <w:t xml:space="preserve">, </w:t>
+      </w:r>
+      <w:r>
+        <w:rPr>
+          <w:rFonts w:ascii="Courier New" w:cs="Courier New" w:eastAsia="Courier New" w:hAnsi="Courier New"/>
+          <w:color w:val="1F2937"/>
+          <w:sz w:val="18"/>
+          <w:szCs w:val="18"/>
+          <w:shd w:fill="EEF1F6" w:color="auto" w:val="clear"/>
+        </w:rPr>
+        <w:t xml:space="preserve">system/apple-touch-icon.png</w:t>
+      </w:r>
+      <w:r>
+        <w:rPr>
+          <w:rFonts w:ascii="Calibri" w:cs="Calibri" w:eastAsia="Calibri" w:hAnsi="Calibri"/>
+          <w:color w:val="1F2937"/>
+        </w:rPr>
+        <w:t xml:space="preserve"> and </w:t>
+      </w:r>
+      <w:r>
+        <w:rPr>
+          <w:rFonts w:ascii="Courier New" w:cs="Courier New" w:eastAsia="Courier New" w:hAnsi="Courier New"/>
+          <w:color w:val="1F2937"/>
+          <w:sz w:val="18"/>
+          <w:szCs w:val="18"/>
+          <w:shd w:fill="EEF1F6" w:color="auto" w:val="clear"/>
+        </w:rPr>
+        <w:t xml:space="preserve">og-image.jpg</w:t>
+      </w:r>
+      <w:r>
+        <w:rPr>
+          <w:rFonts w:ascii="Calibri" w:cs="Calibri" w:eastAsia="Calibri" w:hAnsi="Calibri"/>
+          <w:color w:val="1F2937"/>
+        </w:rPr>
+        <w:t xml:space="preserve"> are never converted: browsers and social networks need them as PNG or JPG.</w:t>
+      </w:r>
+    </w:p>
+    <w:p>
+      <w:pPr>
+        <w:pStyle w:val="ListParagraph"/>
+        <w:numPr>
+          <w:ilvl w:val="0"/>
+          <w:numId w:val="3"/>
+        </w:numPr>
+        <w:spacing w:after="60" w:line="264"/>
+      </w:pPr>
+      <w:r>
+        <w:rPr>
+          <w:rFonts w:ascii="Calibri" w:cs="Calibri" w:eastAsia="Calibri" w:hAnsi="Calibri"/>
+          <w:color w:val="1F2937"/>
+        </w:rPr>
+        <w:t xml:space="preserve">When it finishes, it lists the files in </w:t>
+      </w:r>
+      <w:r>
+        <w:rPr>
+          <w:rFonts w:ascii="Courier New" w:cs="Courier New" w:eastAsia="Courier New" w:hAnsi="Courier New"/>
+          <w:color w:val="1F2937"/>
+          <w:sz w:val="18"/>
+          <w:szCs w:val="18"/>
+          <w:shd w:fill="EEF1F6" w:color="auto" w:val="clear"/>
+        </w:rPr>
+        <w:t xml:space="preserve">src/</w:t>
+      </w:r>
+      <w:r>
+        <w:rPr>
+          <w:rFonts w:ascii="Calibri" w:cs="Calibri" w:eastAsia="Calibri" w:hAnsi="Calibri"/>
+          <w:color w:val="1F2937"/>
+        </w:rPr>
+        <w:t xml:space="preserve"> and the translations that still point to an original name, and reminds you to check the width and height of new mobile screenshots in </w:t>
+      </w:r>
+      <w:r>
+        <w:rPr>
+          <w:rFonts w:ascii="Courier New" w:cs="Courier New" w:eastAsia="Courier New" w:hAnsi="Courier New"/>
+          <w:color w:val="1F2937"/>
+          <w:sz w:val="18"/>
+          <w:szCs w:val="18"/>
+          <w:shd w:fill="EEF1F6" w:color="auto" w:val="clear"/>
+        </w:rPr>
+        <w:t xml:space="preserve">mobile-projects-data.ts</w:t>
+      </w:r>
+      <w:r>
+        <w:rPr>
+          <w:rFonts w:ascii="Calibri" w:cs="Calibri" w:eastAsia="Calibri" w:hAnsi="Calibri"/>
+          <w:color w:val="1F2937"/>
+        </w:rPr>
+        <w:t xml:space="preserve">.</w:t>
+      </w:r>
+    </w:p>
+    <w:p>
+      <w:pPr>
+        <w:pStyle w:val="ListParagraph"/>
+        <w:numPr>
+          <w:ilvl w:val="0"/>
+          <w:numId w:val="3"/>
+        </w:numPr>
+        <w:spacing w:after="60" w:line="264"/>
+      </w:pPr>
+      <w:r>
+        <w:rPr>
+          <w:rFonts w:ascii="Courier New" w:cs="Courier New" w:eastAsia="Courier New" w:hAnsi="Courier New"/>
+          <w:color w:val="1F2937"/>
+          <w:sz w:val="18"/>
+          <w:szCs w:val="18"/>
+          <w:shd w:fill="EEF1F6" w:color="auto" w:val="clear"/>
+        </w:rPr>
+        <w:t xml:space="preserve">npm run images -- --dry-run</w:t>
+      </w:r>
+      <w:r>
+        <w:rPr>
+          <w:rFonts w:ascii="Calibri" w:cs="Calibri" w:eastAsia="Calibri" w:hAnsi="Calibri"/>
+          <w:color w:val="1F2937"/>
+        </w:rPr>
+        <w:t xml:space="preserve"> shows what would happen without changing anything. If an image cannot be read, its original is kept and the command ends with an error.</w:t>
+      </w:r>
+    </w:p>
+    <w:p>
+      <w:pPr>
         <w:pStyle w:val="Heading1"/>
         <w:keepNext/>
         <w:pageBreakBefore/>
@@ -22487,6 +23962,27 @@
           <w:sz w:val="17"/>
           <w:szCs w:val="17"/>
         </w:rPr>
+        <w:t xml:space="preserve">npm run images           # convert new or replaced images to WebP</w:t>
+      </w:r>
+    </w:p>
+    <w:p>
+      <w:pPr>
+        <w:keepNext/>
+        <w:keepLines/>
+        <w:pBdr>
+          <w:left w:val="single" w:color="1F6FD1" w:sz="18" w:space="6"/>
+        </w:pBdr>
+        <w:shd w:fill="F3F4F6" w:color="auto" w:val="clear"/>
+        <w:spacing w:after="0" w:before="0" w:line="252"/>
+        <w:ind w:left="840" w:right="60"/>
+      </w:pPr>
+      <w:r>
+        <w:rPr>
+          <w:rFonts w:ascii="Courier New" w:cs="Courier New" w:eastAsia="Courier New" w:hAnsi="Courier New"/>
+          <w:color w:val="1F2937"/>
+          <w:sz w:val="17"/>
+          <w:szCs w:val="17"/>
+        </w:rPr>
         <w:t xml:space="preserve">npm run lint             # ESLint</w:t>
       </w:r>
     </w:p>
@@ -23064,7 +24560,7 @@
                 <w:sz w:val="19"/>
                 <w:szCs w:val="19"/>
               </w:rPr>
-              <w:t xml:space="preserve">: every path rewrites to the app; security headers on every path; JS and CSS cached for a year (their names carry a hash); images cached for 7 days</w:t>
+              <w:t xml:space="preserve">: every path rewrites to the app; security headers on every path; JS and CSS cached for a year (their names carry a hash); images are revalidated on every visit, so a replaced image shows at once</w:t>
             </w:r>
           </w:p>
         </w:tc>
@@ -23103,7 +24599,7 @@
           <w:sz w:val="20"/>
           <w:szCs w:val="20"/>
         </w:rPr>
-        <w:t xml:space="preserve">Image names do not change between versions. If you replace an image keeping its name, some visitors may see the old one for up to 7 days; give the new image a new name when that matters.</w:t>
+        <w:t xml:space="preserve">Images are not cached long-term: on every visit the browser asks whether an image changed (a tiny 304 answer when it did not), so an image replaced with the same name appears straight away.</w:t>
       </w:r>
     </w:p>
     <w:p>
@@ -23621,7 +25117,55 @@
                 <w:sz w:val="19"/>
                 <w:szCs w:val="19"/>
               </w:rPr>
-              <w:t xml:space="preserve">The browser cache still has the old file with the same name (see "Image cache")</w:t>
+              <w:t xml:space="preserve">It was not converted with </w:t>
+            </w:r>
+            <w:r>
+              <w:rPr>
+                <w:rFonts w:ascii="Courier New" w:cs="Courier New" w:eastAsia="Courier New" w:hAnsi="Courier New"/>
+                <w:color w:val="1F2937"/>
+                <w:sz w:val="18"/>
+                <w:szCs w:val="18"/>
+                <w:shd w:fill="EEF1F6" w:color="auto" w:val="clear"/>
+              </w:rPr>
+              <w:t xml:space="preserve">npm run images</w:t>
+            </w:r>
+            <w:r>
+              <w:rPr>
+                <w:rFonts w:ascii="Calibri" w:cs="Calibri" w:eastAsia="Calibri" w:hAnsi="Calibri"/>
+                <w:color w:val="1F2937"/>
+                <w:sz w:val="19"/>
+                <w:szCs w:val="19"/>
+              </w:rPr>
+              <w:t xml:space="preserve">, or the code still points to the original </w:t>
+            </w:r>
+            <w:r>
+              <w:rPr>
+                <w:rFonts w:ascii="Courier New" w:cs="Courier New" w:eastAsia="Courier New" w:hAnsi="Courier New"/>
+                <w:color w:val="1F2937"/>
+                <w:sz w:val="18"/>
+                <w:szCs w:val="18"/>
+                <w:shd w:fill="EEF1F6" w:color="auto" w:val="clear"/>
+              </w:rPr>
+              <w:t xml:space="preserve">.png</w:t>
+            </w:r>
+            <w:r>
+              <w:rPr>
+                <w:rFonts w:ascii="Calibri" w:cs="Calibri" w:eastAsia="Calibri" w:hAnsi="Calibri"/>
+                <w:color w:val="1F2937"/>
+                <w:sz w:val="19"/>
+                <w:szCs w:val="19"/>
+              </w:rPr>
+              <w:t xml:space="preserve"> or </w:t>
+            </w:r>
+            <w:r>
+              <w:rPr>
+                <w:rFonts w:ascii="Courier New" w:cs="Courier New" w:eastAsia="Courier New" w:hAnsi="Courier New"/>
+                <w:color w:val="1F2937"/>
+                <w:sz w:val="18"/>
+                <w:szCs w:val="18"/>
+                <w:shd w:fill="EEF1F6" w:color="auto" w:val="clear"/>
+              </w:rPr>
+              <w:t xml:space="preserve">.jpg</w:t>
             </w:r>
           </w:p>
         </w:tc>
@@ -24468,6 +26012,118 @@
           </w:p>
         </w:tc>
       </w:tr>
+      <w:tr>
+        <w:trPr>
+          <w:cantSplit/>
+        </w:trPr>
+        <w:tc>
+          <w:tcPr>
+            <w:tcW w:type="dxa" w:w="1900"/>
+            <w:tcBorders>
+              <w:top w:val="single" w:color="C9D3E3" w:sz="4"/>
+              <w:left w:val="single" w:color="C9D3E3" w:sz="4"/>
+              <w:bottom w:val="single" w:color="C9D3E3" w:sz="4"/>
+              <w:right w:val="single" w:color="C9D3E3" w:sz="4"/>
+            </w:tcBorders>
+            <w:shd w:fill="F3F6FC" w:color="auto" w:val="clear"/>
+            <w:tcMar>
+              <w:top w:type="dxa" w:w="60"/>
+              <w:left w:type="dxa" w:w="100"/>
+              <w:bottom w:type="dxa" w:w="60"/>
+              <w:right w:type="dxa" w:w="100"/>
+            </w:tcMar>
+          </w:tcPr>
+          <w:p>
+            <w:pPr>
+              <w:spacing w:after="0" w:line="252"/>
+            </w:pPr>
+            <w:r>
+              <w:rPr>
+                <w:rFonts w:ascii="Calibri" w:cs="Calibri" w:eastAsia="Calibri" w:hAnsi="Calibri"/>
+                <w:color w:val="1F2937"/>
+                <w:sz w:val="19"/>
+                <w:szCs w:val="19"/>
+              </w:rPr>
+              <w:t xml:space="preserve">New or replaced image</w:t>
+            </w:r>
+          </w:p>
+        </w:tc>
+        <w:tc>
+          <w:tcPr>
+            <w:tcW w:type="dxa" w:w="3300"/>
+            <w:tcBorders>
+              <w:top w:val="single" w:color="C9D3E3" w:sz="4"/>
+              <w:left w:val="single" w:color="C9D3E3" w:sz="4"/>
+              <w:bottom w:val="single" w:color="C9D3E3" w:sz="4"/>
+              <w:right w:val="single" w:color="C9D3E3" w:sz="4"/>
+            </w:tcBorders>
+            <w:shd w:fill="F3F6FC" w:color="auto" w:val="clear"/>
+            <w:tcMar>
+              <w:top w:type="dxa" w:w="60"/>
+              <w:left w:type="dxa" w:w="100"/>
+              <w:bottom w:type="dxa" w:w="60"/>
+              <w:right w:type="dxa" w:w="100"/>
+            </w:tcMar>
+          </w:tcPr>
+          <w:p>
+            <w:pPr>
+              <w:spacing w:after="0" w:line="252"/>
+            </w:pPr>
+            <w:r>
+              <w:rPr>
+                <w:rFonts w:ascii="Courier New" w:cs="Courier New" w:eastAsia="Courier New" w:hAnsi="Courier New"/>
+                <w:color w:val="1F2937"/>
+                <w:sz w:val="18"/>
+                <w:szCs w:val="18"/>
+                <w:shd w:fill="EEF1F6" w:color="auto" w:val="clear"/>
+              </w:rPr>
+              <w:t xml:space="preserve">public/assets/images/&lt;folder&gt;/</w:t>
+            </w:r>
+          </w:p>
+        </w:tc>
+        <w:tc>
+          <w:tcPr>
+            <w:tcW w:type="dxa" w:w="3400"/>
+            <w:tcBorders>
+              <w:top w:val="single" w:color="C9D3E3" w:sz="4"/>
+              <w:left w:val="single" w:color="C9D3E3" w:sz="4"/>
+              <w:bottom w:val="single" w:color="C9D3E3" w:sz="4"/>
+              <w:right w:val="single" w:color="C9D3E3" w:sz="4"/>
+            </w:tcBorders>
+            <w:shd w:fill="F3F6FC" w:color="auto" w:val="clear"/>
+            <w:tcMar>
+              <w:top w:type="dxa" w:w="60"/>
+              <w:left w:type="dxa" w:w="100"/>
+              <w:bottom w:type="dxa" w:w="60"/>
+              <w:right w:type="dxa" w:w="100"/>
+            </w:tcMar>
+          </w:tcPr>
+          <w:p>
+            <w:pPr>
+              <w:spacing w:after="0" w:line="252"/>
+            </w:pPr>
+            <w:r>
+              <w:rPr>
+                <w:rFonts w:ascii="Calibri" w:cs="Calibri" w:eastAsia="Calibri" w:hAnsi="Calibri"/>
+                <w:color w:val="1F2937"/>
+                <w:sz w:val="19"/>
+                <w:szCs w:val="19"/>
+              </w:rPr>
+              <w:t xml:space="preserve">Drop the PNG or JPG and run </w:t>
+            </w:r>
+            <w:r>
+              <w:rPr>
+                <w:rFonts w:ascii="Courier New" w:cs="Courier New" w:eastAsia="Courier New" w:hAnsi="Courier New"/>
+                <w:color w:val="1F2937"/>
+                <w:sz w:val="18"/>
+                <w:szCs w:val="18"/>
+                <w:shd w:fill="EEF1F6" w:color="auto" w:val="clear"/>
+              </w:rPr>
+              <w:t xml:space="preserve">npm run images</w:t>
+            </w:r>
+          </w:p>
+        </w:tc>
+      </w:tr>
     </w:tbl>
     <w:p>
       <w:pPr>
@@ -25131,7 +26787,7 @@
           <w:rFonts w:ascii="Calibri" w:cs="Calibri" w:eastAsia="Calibri" w:hAnsi="Calibri"/>
           <w:color w:val="1F2937"/>
         </w:rPr>
-        <w:t xml:space="preserve">Add a 144 × 144 px WebP icon to </w:t>
+        <w:t xml:space="preserve">Drop the icon (PNG or JPG) into </w:t>
       </w:r>
       <w:r>
         <w:rPr>
@@ -25148,7 +26804,24 @@
           <w:rFonts w:ascii="Calibri" w:cs="Calibri" w:eastAsia="Calibri" w:hAnsi="Calibri"/>
           <w:color w:val="1F2937"/>
         </w:rPr>
-        <w:t xml:space="preserve">.</w:t>
+        <w:t xml:space="preserve"> and run </w:t>
+      </w:r>
+      <w:r>
+        <w:rPr>
+          <w:rFonts w:ascii="Courier New" w:cs="Courier New" w:eastAsia="Courier New" w:hAnsi="Courier New"/>
+          <w:color w:val="1F2937"/>
+          <w:sz w:val="18"/>
+          <w:szCs w:val="18"/>
+          <w:shd w:fill="EEF1F6" w:color="auto" w:val="clear"/>
+        </w:rPr>
+        <w:t xml:space="preserve">npm run images</w:t>
+      </w:r>
+      <w:r>
+        <w:rPr>
+          <w:rFonts w:ascii="Calibri" w:cs="Calibri" w:eastAsia="Calibri" w:hAnsi="Calibri"/>
+          <w:color w:val="1F2937"/>
+        </w:rPr>
+        <w:t xml:space="preserve">; it becomes a 144 × 144 px WebP.</w:t>
       </w:r>
     </w:p>
     <w:p>
@@ -25324,7 +26997,7 @@
           <w:rFonts w:ascii="Calibri" w:cs="Calibri" w:eastAsia="Calibri" w:hAnsi="Calibri"/>
           <w:color w:val="1F2937"/>
         </w:rPr>
-        <w:t xml:space="preserve">Add a 1280 px wide WebP screenshot to </w:t>
+        <w:t xml:space="preserve">Drop the screenshot (PNG or JPG) into </w:t>
       </w:r>
       <w:r>
         <w:rPr>
@@ -25341,7 +27014,41 @@
           <w:rFonts w:ascii="Calibri" w:cs="Calibri" w:eastAsia="Calibri" w:hAnsi="Calibri"/>
           <w:color w:val="1F2937"/>
         </w:rPr>
-        <w:t xml:space="preserve"> and set it as </w:t>
+        <w:t xml:space="preserve">, run </w:t>
+      </w:r>
+      <w:r>
+        <w:rPr>
+          <w:rFonts w:ascii="Courier New" w:cs="Courier New" w:eastAsia="Courier New" w:hAnsi="Courier New"/>
+          <w:color w:val="1F2937"/>
+          <w:sz w:val="18"/>
+          <w:szCs w:val="18"/>
+          <w:shd w:fill="EEF1F6" w:color="auto" w:val="clear"/>
+        </w:rPr>
+        <w:t xml:space="preserve">npm run images</w:t>
+      </w:r>
+      <w:r>
+        <w:rPr>
+          <w:rFonts w:ascii="Calibri" w:cs="Calibri" w:eastAsia="Calibri" w:hAnsi="Calibri"/>
+          <w:color w:val="1F2937"/>
+        </w:rPr>
+        <w:t xml:space="preserve"> and set the resulting </w:t>
+      </w:r>
+      <w:r>
+        <w:rPr>
+          <w:rFonts w:ascii="Courier New" w:cs="Courier New" w:eastAsia="Courier New" w:hAnsi="Courier New"/>
+          <w:color w:val="1F2937"/>
+          <w:sz w:val="18"/>
+          <w:szCs w:val="18"/>
+          <w:shd w:fill="EEF1F6" w:color="auto" w:val="clear"/>
+        </w:rPr>
+        <w:t xml:space="preserve">.webp</w:t>
+      </w:r>
+      <w:r>
+        <w:rPr>
+          <w:rFonts w:ascii="Calibri" w:cs="Calibri" w:eastAsia="Calibri" w:hAnsi="Calibri"/>
+          <w:color w:val="1F2937"/>
+        </w:rPr>
+        <w:t xml:space="preserve"> as </w:t>
       </w:r>
       <w:r>
         <w:rPr>
@@ -25527,7 +27234,7 @@
           <w:rFonts w:ascii="Calibri" w:cs="Calibri" w:eastAsia="Calibri" w:hAnsi="Calibri"/>
           <w:color w:val="1F2937"/>
         </w:rPr>
-        <w:t xml:space="preserve">Add the screenshots as WebP to </w:t>
+        <w:t xml:space="preserve">Drop the screenshots into </w:t>
       </w:r>
       <w:r>
         <w:rPr>
@@ -25544,7 +27251,24 @@
           <w:rFonts w:ascii="Calibri" w:cs="Calibri" w:eastAsia="Calibri" w:hAnsi="Calibri"/>
           <w:color w:val="1F2937"/>
         </w:rPr>
-        <w:t xml:space="preserve">; keep their full resolution so the zoom stays sharp.</w:t>
+        <w:t xml:space="preserve"> and run </w:t>
+      </w:r>
+      <w:r>
+        <w:rPr>
+          <w:rFonts w:ascii="Courier New" w:cs="Courier New" w:eastAsia="Courier New" w:hAnsi="Courier New"/>
+          <w:color w:val="1F2937"/>
+          <w:sz w:val="18"/>
+          <w:szCs w:val="18"/>
+          <w:shd w:fill="EEF1F6" w:color="auto" w:val="clear"/>
+        </w:rPr>
+        <w:t xml:space="preserve">npm run images</w:t>
+      </w:r>
+      <w:r>
+        <w:rPr>
+          <w:rFonts w:ascii="Calibri" w:cs="Calibri" w:eastAsia="Calibri" w:hAnsi="Calibri"/>
+          <w:color w:val="1F2937"/>
+        </w:rPr>
+        <w:t xml:space="preserve">. It keeps their full resolution so the zoom stays sharp, and prints the width and height to use in the data file.</w:t>
       </w:r>
     </w:p>
     <w:p>
@@ -25954,6 +27678,40 @@
           <w:color w:val="1F2937"/>
         </w:rPr>
         <w:t xml:space="preserve"> still reports 0 vulnerabilities.</w:t>
+      </w:r>
+    </w:p>
+    <w:p>
+      <w:pPr>
+        <w:pStyle w:val="ListParagraph"/>
+        <w:numPr>
+          <w:ilvl w:val="0"/>
+          <w:numId w:val="3"/>
+        </w:numPr>
+        <w:spacing w:after="60" w:line="264"/>
+      </w:pPr>
+      <w:r>
+        <w:rPr>
+          <w:rFonts w:ascii="Calibri" w:cs="Calibri" w:eastAsia="Calibri" w:hAnsi="Calibri"/>
+          <w:color w:val="1F2937"/>
+        </w:rPr>
+        <w:t xml:space="preserve">New or replaced images were converted with </w:t>
+      </w:r>
+      <w:r>
+        <w:rPr>
+          <w:rFonts w:ascii="Courier New" w:cs="Courier New" w:eastAsia="Courier New" w:hAnsi="Courier New"/>
+          <w:color w:val="1F2937"/>
+          <w:sz w:val="18"/>
+          <w:szCs w:val="18"/>
+          <w:shd w:fill="EEF1F6" w:color="auto" w:val="clear"/>
+        </w:rPr>
+        <w:t xml:space="preserve">npm run images</w:t>
+      </w:r>
+      <w:r>
+        <w:rPr>
+          <w:rFonts w:ascii="Calibri" w:cs="Calibri" w:eastAsia="Calibri" w:hAnsi="Calibri"/>
+          <w:color w:val="1F2937"/>
+        </w:rPr>
+        <w:t xml:space="preserve">.</w:t>
       </w:r>
     </w:p>
     <w:p>
@@ -28918,6 +30676,126 @@
                 <w:szCs w:val="19"/>
               </w:rPr>
               <w:t xml:space="preserve">README screenshots and this technical manual</w:t>
+            </w:r>
+          </w:p>
+        </w:tc>
+      </w:tr>
+      <w:tr>
+        <w:trPr>
+          <w:cantSplit/>
+        </w:trPr>
+        <w:tc>
+          <w:tcPr>
+            <w:tcW w:type="dxa" w:w="1200"/>
+            <w:tcBorders>
+              <w:top w:val="single" w:color="C9D3E3" w:sz="4"/>
+              <w:left w:val="single" w:color="C9D3E3" w:sz="4"/>
+              <w:bottom w:val="single" w:color="C9D3E3" w:sz="4"/>
+              <w:right w:val="single" w:color="C9D3E3" w:sz="4"/>
+            </w:tcBorders>
+            <w:shd w:fill="F3F6FC" w:color="auto" w:val="clear"/>
+            <w:tcMar>
+              <w:top w:type="dxa" w:w="60"/>
+              <w:left w:type="dxa" w:w="100"/>
+              <w:bottom w:type="dxa" w:w="60"/>
+              <w:right w:type="dxa" w:w="100"/>
+            </w:tcMar>
+          </w:tcPr>
+          <w:p>
+            <w:pPr>
+              <w:spacing w:after="0" w:line="252"/>
+            </w:pPr>
+            <w:r>
+              <w:rPr>
+                <w:rFonts w:ascii="Calibri" w:cs="Calibri" w:eastAsia="Calibri" w:hAnsi="Calibri"/>
+                <w:color w:val="1F2937"/>
+                <w:sz w:val="19"/>
+                <w:szCs w:val="19"/>
+              </w:rPr>
+              <w:t xml:space="preserve">1.1</w:t>
+            </w:r>
+          </w:p>
+        </w:tc>
+        <w:tc>
+          <w:tcPr>
+            <w:tcW w:type="dxa" w:w="1800"/>
+            <w:tcBorders>
+              <w:top w:val="single" w:color="C9D3E3" w:sz="4"/>
+              <w:left w:val="single" w:color="C9D3E3" w:sz="4"/>
+              <w:bottom w:val="single" w:color="C9D3E3" w:sz="4"/>
+              <w:right w:val="single" w:color="C9D3E3" w:sz="4"/>
+            </w:tcBorders>
+            <w:shd w:fill="F3F6FC" w:color="auto" w:val="clear"/>
+            <w:tcMar>
+              <w:top w:type="dxa" w:w="60"/>
+              <w:left w:type="dxa" w:w="100"/>
+              <w:bottom w:type="dxa" w:w="60"/>
+              <w:right w:type="dxa" w:w="100"/>
+            </w:tcMar>
+          </w:tcPr>
+          <w:p>
+            <w:pPr>
+              <w:spacing w:after="0" w:line="252"/>
+            </w:pPr>
+            <w:r>
+              <w:rPr>
+                <w:rFonts w:ascii="Calibri" w:cs="Calibri" w:eastAsia="Calibri" w:hAnsi="Calibri"/>
+                <w:color w:val="1F2937"/>
+                <w:sz w:val="19"/>
+                <w:szCs w:val="19"/>
+              </w:rPr>
+              <w:t xml:space="preserve">Oct 28, 2026</w:t>
+            </w:r>
+          </w:p>
+        </w:tc>
+        <w:tc>
+          <w:tcPr>
+            <w:tcW w:type="dxa" w:w="5600"/>
+            <w:tcBorders>
+              <w:top w:val="single" w:color="C9D3E3" w:sz="4"/>
+              <w:left w:val="single" w:color="C9D3E3" w:sz="4"/>
+              <w:bottom w:val="single" w:color="C9D3E3" w:sz="4"/>
+              <w:right w:val="single" w:color="C9D3E3" w:sz="4"/>
+            </w:tcBorders>
+            <w:shd w:fill="F3F6FC" w:color="auto" w:val="clear"/>
+            <w:tcMar>
+              <w:top w:type="dxa" w:w="60"/>
+              <w:left w:type="dxa" w:w="100"/>
+              <w:bottom w:type="dxa" w:w="60"/>
+              <w:right w:type="dxa" w:w="100"/>
+            </w:tcMar>
+          </w:tcPr>
+          <w:p>
+            <w:pPr>
+              <w:spacing w:after="0" w:line="252"/>
+            </w:pPr>
+            <w:r>
+              <w:rPr>
+                <w:rFonts w:ascii="Calibri" w:cs="Calibri" w:eastAsia="Calibri" w:hAnsi="Calibri"/>
+                <w:color w:val="1F2937"/>
+                <w:sz w:val="19"/>
+                <w:szCs w:val="19"/>
+              </w:rPr>
+              <w:t xml:space="preserve">Image optimization command (</w:t>
+            </w:r>
+            <w:r>
+              <w:rPr>
+                <w:rFonts w:ascii="Courier New" w:cs="Courier New" w:eastAsia="Courier New" w:hAnsi="Courier New"/>
+                <w:color w:val="1F2937"/>
+                <w:sz w:val="18"/>
+                <w:szCs w:val="18"/>
+                <w:shd w:fill="EEF1F6" w:color="auto" w:val="clear"/>
+              </w:rPr>
+              <w:t xml:space="preserve">npm run images</w:t>
+            </w:r>
+            <w:r>
+              <w:rPr>
+                <w:rFonts w:ascii="Calibri" w:cs="Calibri" w:eastAsia="Calibri" w:hAnsi="Calibri"/>
+                <w:color w:val="1F2937"/>
+                <w:sz w:val="19"/>
+                <w:szCs w:val="19"/>
+              </w:rPr>
+              <w:t xml:space="preserve">); images revalidate instead of a 7-day cache; Prettier keeps line endings</w:t>
             </w:r>
           </w:p>
         </w:tc>
@@ -29151,7 +31029,7 @@
       </w:rPr>
       <w:t xml:space="preserve">Portfolio XP · Technical Manual</w:t>
       <w:tab/>
-      <w:t xml:space="preserve">Version 1.0</w:t>
+      <w:t xml:space="preserve">Version 1.1</w:t>
     </w:r>
   </w:p>
 </w:hdr>

</xml_diff>